<commit_message>
Data preview in SQL-editor Story
</commit_message>
<xml_diff>
--- a/01.10.26_ФРП_Экраны_ошибок/ФРП_ГИСП_экранные_формы_ошибок_для_согласования_V2.docx
+++ b/01.10.26_ФРП_Экраны_ошибок/ФРП_ГИСП_экранные_формы_ошибок_для_согласования_V2.docx
@@ -407,7 +407,7 @@
                 <w:color w:val="263445"/>
                 <w:sz w:val="20"/>
               </w:rPr>
-              <w:t>Узкий вариант (предварительный)</w:t>
+              <w:t>Узкий вариант</w:t>
             </w:r>
           </w:p>
         </w:tc>
@@ -1149,7 +1149,11 @@
               <w:pStyle w:val="Normal"/>
               <w:spacing w:before="0" w:after="40"/>
               <w:jc w:val="center"/>
-              <w:rPr/>
+              <w:rPr>
+                <w:b/>
+                <w:color w:val="111827"/>
+                <w:sz w:val="22"/>
+              </w:rPr>
             </w:pPr>
             <w:r>
               <w:rPr>
@@ -1159,13 +1163,37 @@
               </w:rPr>
               <w:t>В составе отчёта</w:t>
             </w:r>
+          </w:p>
+          <w:p>
+            <w:pPr>
+              <w:pStyle w:val="Normal"/>
+              <w:spacing w:before="0" w:after="40"/>
+              <w:jc w:val="center"/>
+              <w:rPr>
+                <w:b/>
+                <w:color w:val="111827"/>
+                <w:sz w:val="22"/>
+              </w:rPr>
+            </w:pPr>
             <w:r>
-              <w:rPr/>
+              <w:rPr>
+                <w:b/>
+                <w:color w:val="111827"/>
+                <w:sz w:val="22"/>
+              </w:rPr>
               <w:drawing>
-                <wp:inline distT="0" distB="0" distL="0" distR="0">
-                  <wp:extent cx="6245225" cy="3976370"/>
+                <wp:anchor distT="0" distB="0" distL="0" distR="0" simplePos="0" relativeHeight="9" behindDoc="0" locked="0" layoutInCell="0" allowOverlap="1">
+                  <wp:simplePos x="0" y="0"/>
+                  <wp:positionH relativeFrom="column">
+                    <wp:align>center</wp:align>
+                  </wp:positionH>
+                  <wp:positionV relativeFrom="paragraph">
+                    <wp:posOffset>635</wp:posOffset>
+                  </wp:positionV>
+                  <wp:extent cx="7038340" cy="3181985"/>
                   <wp:effectExtent l="0" t="0" r="0" b="0"/>
-                  <wp:docPr id="5" name="Picture 6" descr="ФРП_ошибка_визуализации_исправлено.png"/>
+                  <wp:wrapSquare wrapText="largest"/>
+                  <wp:docPr id="5" name="Image2"/>
                   <wp:cNvGraphicFramePr>
                     <a:graphicFrameLocks xmlns:a="http://schemas.openxmlformats.org/drawingml/2006/main" noChangeAspect="1"/>
                   </wp:cNvGraphicFramePr>
@@ -1173,7 +1201,7 @@
                     <a:graphicData uri="http://schemas.openxmlformats.org/drawingml/2006/picture">
                       <pic:pic xmlns:pic="http://schemas.openxmlformats.org/drawingml/2006/picture">
                         <pic:nvPicPr>
-                          <pic:cNvPr id="5" name="Picture 6" descr="ФРП_ошибка_визуализации_исправлено.png"/>
+                          <pic:cNvPr id="5" name="Image2"/>
                           <pic:cNvPicPr>
                             <a:picLocks noChangeAspect="1" noChangeArrowheads="1"/>
                           </pic:cNvPicPr>
@@ -1187,7 +1215,7 @@
                         <pic:spPr bwMode="auto">
                           <a:xfrm>
                             <a:off x="0" y="0"/>
-                            <a:ext cx="6245225" cy="3976370"/>
+                            <a:ext cx="7038340" cy="3181985"/>
                           </a:xfrm>
                           <a:prstGeom prst="rect">
                             <a:avLst/>
@@ -1197,7 +1225,7 @@
                       </pic:pic>
                     </a:graphicData>
                   </a:graphic>
-                </wp:inline>
+                </wp:anchor>
               </w:drawing>
             </w:r>
           </w:p>
@@ -1255,7 +1283,11 @@
               <w:pStyle w:val="Normal"/>
               <w:spacing w:before="0" w:after="40"/>
               <w:jc w:val="center"/>
-              <w:rPr/>
+              <w:rPr>
+                <w:b/>
+                <w:color w:val="111827"/>
+                <w:sz w:val="22"/>
+              </w:rPr>
             </w:pPr>
             <w:r>
               <w:rPr>
@@ -1263,15 +1295,39 @@
                 <w:color w:val="111827"/>
                 <w:sz w:val="22"/>
               </w:rPr>
-              <w:t>Узкий вариант (предварительно)</w:t>
+              <w:t>Узкий вариант</w:t>
             </w:r>
+          </w:p>
+          <w:p>
+            <w:pPr>
+              <w:pStyle w:val="Normal"/>
+              <w:spacing w:before="0" w:after="40"/>
+              <w:jc w:val="center"/>
+              <w:rPr>
+                <w:b/>
+                <w:color w:val="111827"/>
+                <w:sz w:val="22"/>
+              </w:rPr>
+            </w:pPr>
             <w:r>
-              <w:rPr/>
+              <w:rPr>
+                <w:b/>
+                <w:color w:val="111827"/>
+                <w:sz w:val="22"/>
+              </w:rPr>
               <w:drawing>
-                <wp:inline distT="0" distB="0" distL="0" distR="0">
-                  <wp:extent cx="2057400" cy="2423160"/>
+                <wp:anchor distT="0" distB="0" distL="0" distR="0" simplePos="0" relativeHeight="8" behindDoc="0" locked="0" layoutInCell="0" allowOverlap="1">
+                  <wp:simplePos x="0" y="0"/>
+                  <wp:positionH relativeFrom="column">
+                    <wp:align>center</wp:align>
+                  </wp:positionH>
+                  <wp:positionV relativeFrom="paragraph">
+                    <wp:posOffset>635</wp:posOffset>
+                  </wp:positionV>
+                  <wp:extent cx="2237740" cy="2049780"/>
                   <wp:effectExtent l="0" t="0" r="0" b="0"/>
-                  <wp:docPr id="6" name="Picture 7" descr="ФРП_ошибка_визуализации_mobile_узкое_исправлено.png"/>
+                  <wp:wrapSquare wrapText="largest"/>
+                  <wp:docPr id="6" name="Image1"/>
                   <wp:cNvGraphicFramePr>
                     <a:graphicFrameLocks xmlns:a="http://schemas.openxmlformats.org/drawingml/2006/main" noChangeAspect="1"/>
                   </wp:cNvGraphicFramePr>
@@ -1279,7 +1335,7 @@
                     <a:graphicData uri="http://schemas.openxmlformats.org/drawingml/2006/picture">
                       <pic:pic xmlns:pic="http://schemas.openxmlformats.org/drawingml/2006/picture">
                         <pic:nvPicPr>
-                          <pic:cNvPr id="6" name="Picture 7" descr="ФРП_ошибка_визуализации_mobile_узкое_исправлено.png"/>
+                          <pic:cNvPr id="6" name="Image1"/>
                           <pic:cNvPicPr>
                             <a:picLocks noChangeAspect="1" noChangeArrowheads="1"/>
                           </pic:cNvPicPr>
@@ -1293,7 +1349,7 @@
                         <pic:spPr bwMode="auto">
                           <a:xfrm>
                             <a:off x="0" y="0"/>
-                            <a:ext cx="2057400" cy="2423160"/>
+                            <a:ext cx="2237740" cy="2049780"/>
                           </a:xfrm>
                           <a:prstGeom prst="rect">
                             <a:avLst/>
@@ -1303,22 +1359,8 @@
                       </pic:pic>
                     </a:graphicData>
                   </a:graphic>
-                </wp:inline>
+                </wp:anchor>
               </w:drawing>
-            </w:r>
-          </w:p>
-          <w:p>
-            <w:pPr>
-              <w:pStyle w:val="Normal"/>
-              <w:spacing w:before="0" w:after="40"/>
-              <w:rPr/>
-            </w:pPr>
-            <w:r>
-              <w:rPr>
-                <w:b w:val="false"/>
-                <w:sz w:val="16"/>
-              </w:rPr>
-              <w:t>Внешний вид не согласован; ожидается вариант дизайнера.</w:t>
             </w:r>
           </w:p>
           <w:p>
@@ -1329,10 +1371,32 @@
             </w:pPr>
             <w:r>
               <w:rPr>
+                <w:b/>
+                <w:color w:val="111827"/>
+                <w:sz w:val="17"/>
+              </w:rPr>
+              <w:t xml:space="preserve">Согласование: </w:t>
+            </w:r>
+            <w:r>
+              <w:rPr>
+                <w:b w:val="false"/>
+                <w:color w:val="667085"/>
+                <w:sz w:val="17"/>
+              </w:rPr>
+              <w:t>☐ согласовано</w:t>
+            </w:r>
+          </w:p>
+          <w:p>
+            <w:pPr>
+              <w:pStyle w:val="Normal"/>
+              <w:spacing w:before="20" w:after="0"/>
+              <w:rPr>
                 <w:b w:val="false"/>
                 <w:sz w:val="17"/>
               </w:rPr>
-              <w:t>Статус: ☐ на доработке</w:t>
+            </w:pPr>
+            <w:r>
+              <w:rPr/>
             </w:r>
           </w:p>
           <w:p>
@@ -1964,21 +2028,7 @@
                 <w:b w:val="false"/>
                 <w:sz w:val="18"/>
               </w:rPr>
-              <w:t xml:space="preserve">Зафиксировано направление на главную ГИСП (не </w:t>
-            </w:r>
-            <w:r>
-              <w:rPr>
-                <w:b w:val="false"/>
-                <w:sz w:val="18"/>
-              </w:rPr>
-              <w:t>Аналитический портал</w:t>
-            </w:r>
-            <w:r>
-              <w:rPr>
-                <w:b w:val="false"/>
-                <w:sz w:val="18"/>
-              </w:rPr>
-              <w:t>).</w:t>
+              <w:t>Зафиксировано направление на главную ГИСП (не Аналитический портал).</w:t>
             </w:r>
           </w:p>
         </w:tc>
@@ -2050,21 +2100,7 @@
                 <w:b w:val="false"/>
                 <w:sz w:val="18"/>
               </w:rPr>
-              <w:t>Зафиксировано по Figma: Golos UI, Regular, 400; базовый размер 16 px, межстрочный интервал 20 px, letter-spacing 0. Иерархия размеров заголовков сохраня</w:t>
-            </w:r>
-            <w:r>
-              <w:rPr>
-                <w:b w:val="false"/>
-                <w:sz w:val="18"/>
-              </w:rPr>
-              <w:t>ется</w:t>
-            </w:r>
-            <w:r>
-              <w:rPr>
-                <w:b w:val="false"/>
-                <w:sz w:val="18"/>
-              </w:rPr>
-              <w:t>.</w:t>
+              <w:t>Зафиксировано по Figma: Golos UI, Regular, 400; базовый размер 16 px, межстрочный интервал 20 px, letter-spacing 0. Иерархия размеров заголовков сохраняется.</w:t>
             </w:r>
           </w:p>
         </w:tc>
@@ -2136,28 +2172,7 @@
                 <w:b w:val="false"/>
                 <w:sz w:val="18"/>
               </w:rPr>
-              <w:t xml:space="preserve">Внешний вид </w:t>
-            </w:r>
-            <w:r>
-              <w:rPr>
-                <w:b w:val="false"/>
-                <w:sz w:val="18"/>
-              </w:rPr>
-              <w:t>оригинального экрана</w:t>
-            </w:r>
-            <w:r>
-              <w:rPr>
-                <w:b w:val="false"/>
-                <w:sz w:val="18"/>
-              </w:rPr>
-              <w:t xml:space="preserve"> не согласован. Ожидается новый макет дизайнера; представленный узкий вариант — для ознакомления и сбора замечаний. </w:t>
-            </w:r>
-            <w:r>
-              <w:rPr>
-                <w:b w:val="false"/>
-                <w:sz w:val="18"/>
-              </w:rPr>
-              <w:t>В случае, если обновлённый экран вас устроит, допускается его согласование в рамках всего пакета.</w:t>
+              <w:t>Внешний вид оригинального экрана не согласован. Ожидается новый макет дизайнера; представленный узкий вариант — для ознакомления и сбора замечаний. В случае, если обновлённый экран вас устроит, допускается его согласование в рамках всего пакета.</w:t>
             </w:r>
           </w:p>
         </w:tc>
@@ -2229,21 +2244,7 @@
                 <w:b w:val="false"/>
                 <w:sz w:val="18"/>
               </w:rPr>
-              <w:t>П</w:t>
-            </w:r>
-            <w:r>
-              <w:rPr>
-                <w:b w:val="false"/>
-                <w:sz w:val="18"/>
-              </w:rPr>
-              <w:t>росим п</w:t>
-            </w:r>
-            <w:r>
-              <w:rPr>
-                <w:b w:val="false"/>
-                <w:sz w:val="18"/>
-              </w:rPr>
-              <w:t>одтвердить, что дополнительный футер на экранах ошибок не требуется.</w:t>
+              <w:t>Просим подтвердить, что дополнительный футер на экранах ошибок не требуется.</w:t>
             </w:r>
           </w:p>
         </w:tc>

</xml_diff>

<commit_message>
(26.10.26) - Data preview in the SQL-editor Story and Mockup
</commit_message>
<xml_diff>
--- a/01.10.26_ФРП_Экраны_ошибок/ФРП_ГИСП_экранные_формы_ошибок_для_согласования_V2.docx
+++ b/01.10.26_ФРП_Экраны_ошибок/ФРП_ГИСП_экранные_формы_ошибок_для_согласования_V2.docx
@@ -1185,12 +1185,12 @@
                 <wp:anchor distT="0" distB="0" distL="0" distR="0" simplePos="0" relativeHeight="9" behindDoc="0" locked="0" layoutInCell="0" allowOverlap="1">
                   <wp:simplePos x="0" y="0"/>
                   <wp:positionH relativeFrom="column">
-                    <wp:align>center</wp:align>
+                    <wp:posOffset>158115</wp:posOffset>
                   </wp:positionH>
                   <wp:positionV relativeFrom="paragraph">
-                    <wp:posOffset>635</wp:posOffset>
+                    <wp:posOffset>36830</wp:posOffset>
                   </wp:positionV>
-                  <wp:extent cx="7038340" cy="3181985"/>
+                  <wp:extent cx="6559550" cy="2965450"/>
                   <wp:effectExtent l="0" t="0" r="0" b="0"/>
                   <wp:wrapSquare wrapText="largest"/>
                   <wp:docPr id="5" name="Image2"/>
@@ -1215,7 +1215,7 @@
                         <pic:spPr bwMode="auto">
                           <a:xfrm>
                             <a:off x="0" y="0"/>
-                            <a:ext cx="7038340" cy="3181985"/>
+                            <a:ext cx="6559550" cy="2965450"/>
                           </a:xfrm>
                           <a:prstGeom prst="rect">
                             <a:avLst/>
@@ -1290,39 +1290,14 @@
               </w:rPr>
             </w:pPr>
             <w:r>
-              <w:rPr>
-                <w:b/>
-                <w:color w:val="111827"/>
-                <w:sz w:val="22"/>
-              </w:rPr>
-              <w:t>Узкий вариант</w:t>
-            </w:r>
-          </w:p>
-          <w:p>
-            <w:pPr>
-              <w:pStyle w:val="Normal"/>
-              <w:spacing w:before="0" w:after="40"/>
-              <w:jc w:val="center"/>
-              <w:rPr>
-                <w:b/>
-                <w:color w:val="111827"/>
-                <w:sz w:val="22"/>
-              </w:rPr>
-            </w:pPr>
-            <w:r>
-              <w:rPr>
-                <w:b/>
-                <w:color w:val="111827"/>
-                <w:sz w:val="22"/>
-              </w:rPr>
               <w:drawing>
                 <wp:anchor distT="0" distB="0" distL="0" distR="0" simplePos="0" relativeHeight="8" behindDoc="0" locked="0" layoutInCell="0" allowOverlap="1">
                   <wp:simplePos x="0" y="0"/>
                   <wp:positionH relativeFrom="column">
-                    <wp:align>center</wp:align>
+                    <wp:posOffset>87630</wp:posOffset>
                   </wp:positionH>
                   <wp:positionV relativeFrom="paragraph">
-                    <wp:posOffset>635</wp:posOffset>
+                    <wp:posOffset>323850</wp:posOffset>
                   </wp:positionV>
                   <wp:extent cx="2237740" cy="2049780"/>
                   <wp:effectExtent l="0" t="0" r="0" b="0"/>
@@ -1362,6 +1337,33 @@
                 </wp:anchor>
               </w:drawing>
             </w:r>
+            <w:r>
+              <w:rPr>
+                <w:b/>
+                <w:color w:val="111827"/>
+                <w:sz w:val="22"/>
+              </w:rPr>
+              <w:t>Узкий вариант</w:t>
+            </w:r>
+          </w:p>
+          <w:p>
+            <w:pPr>
+              <w:pStyle w:val="Normal"/>
+              <w:spacing w:before="0" w:after="40"/>
+              <w:jc w:val="center"/>
+              <w:rPr>
+                <w:b/>
+                <w:color w:val="111827"/>
+                <w:sz w:val="22"/>
+              </w:rPr>
+            </w:pPr>
+            <w:r>
+              <w:rPr>
+                <w:b/>
+                <w:color w:val="111827"/>
+                <w:sz w:val="22"/>
+              </w:rPr>
+            </w:r>
           </w:p>
           <w:p>
             <w:pPr>
@@ -1396,7 +1398,10 @@
               </w:rPr>
             </w:pPr>
             <w:r>
-              <w:rPr/>
+              <w:rPr>
+                <w:b w:val="false"/>
+                <w:sz w:val="17"/>
+              </w:rPr>
             </w:r>
           </w:p>
           <w:p>

</xml_diff>